<commit_message>
feat: optional Non-Local commission + unblock MY LC part-timer
Non-Local Secondment:
- Sales Commission Scheme is now its own toggle (hasCommissionScheme) —
  hires with no commission get neither the scheme nor the guarantee.
- Guaranteed-commission toggle nested under it; guarantee is suppressed
  in output when the scheme is off. IntakeForm showIf now transitive.

Malaysia LC Part-Timer (was blocked):
- Reconstructed a content-faithful tokenised .docx from LC's PDFs
  (clauses 1-12, OT multiplier table, footer, Irene Law signatory).
  No official Word file was ever supplied; swap in if it surfaces.
- Replaced firstName-derived salutation with an explicit operator field
  (surname-first names like "Chen Mei Jun" -> "Dear Mei Jun,").
- Removed from the home-page blocked list; now live.

tsc + eslint clean; 90 tests pass (was 81); production build OK.

Co-Authored-By: Claude Opus 4.8 (1M context) <noreply@anthropic.com>
</commit_message>
<xml_diff>
--- a/public/templates/sg-non-local-secondment.tokenised.docx
+++ b/public/templates/sg-non-local-secondment.tokenised.docx
@@ -565,23 +565,7 @@
           <w:sz w:val="22"/>
           <w:szCs w:val="22"/>
         </w:rPr>
-        <w:t>You will be eligible to participate in the Client’s Sales Commission Scheme which is designed to ensure that your effort will be rewarded in line with the Client’s sales performance. The Scheme is administered as per the prevailing policy in force from time to time and may be changed at the sole discretion of the Client without prior notice to you. The commission amount is payable in arrears based on the Client pay</w:t>
-      </w:r>
-      <w:r>
-        <w:rPr>
-          <w:color w:val="EE0000"/>
-          <w:sz w:val="22"/>
-          <w:szCs w:val="22"/>
-        </w:rPr>
-        <w:t>ment</w:t>
-      </w:r>
-      <w:r>
-        <w:rPr>
-          <w:color w:val="EE0000"/>
-          <w:sz w:val="22"/>
-          <w:szCs w:val="22"/>
-        </w:rPr>
-        <w:t xml:space="preserve"> arrangements.</w:t>
+        <w:t xml:space="preserve">{#hasCommissionScheme}You will be eligible to participate in the Client’s Sales Commission Scheme which is designed to ensure that your effort will be rewarded in line with the Client’s sales performance. The Scheme is administered as per the prevailing policy in force from time to time and may be changed at the sole discretion of the Client without prior notice to you. The commission amount is payable in arrears based on the Client payment arrangements.{/hasCommissionScheme}</w:t>
       </w:r>
     </w:p>
     <w:p>

</xml_diff>